<commit_message>
Restamp the audit at the commit it describes
Co-Authored-By: Claude Opus 5 <noreply@anthropic.com>
Claude-Session: https://claude.ai/code/session_01B2xsFCpQEfEHuTCkYzyD13
</commit_message>
<xml_diff>
--- a/WEBSITE_COSTINGS.docx
+++ b/WEBSITE_COSTINGS.docx
@@ -449,7 +449,7 @@
                 <w:sz w:val="20"/>
                 <w:szCs w:val="20"/>
               </w:rPr>
-              <w:t xml:space="preserve">2a5a1c6</w:t>
+              <w:t xml:space="preserve">d1b425e</w:t>
             </w:r>
           </w:p>
         </w:tc>
@@ -1865,7 +1865,7 @@
                 <w:sz w:val="20"/>
                 <w:szCs w:val="20"/>
               </w:rPr>
-              <w:t xml:space="preserve">155</w:t>
+              <w:t xml:space="preserve">156</w:t>
             </w:r>
           </w:p>
         </w:tc>

</xml_diff>